<commit_message>
Backup survey review and reward flow updates
</commit_message>
<xml_diff>
--- a/02_規劃書/update/2026-06-15-驗收說明書/VeeVa會員管理系統_驗收說明書.docx
+++ b/02_規劃書/update/2026-06-15-驗收說明書/VeeVa會員管理系統_驗收說明書.docx
@@ -1802,6 +1802,20 @@
           <w:color w:val="122320"/>
           <w:sz w:val="21"/>
         </w:rPr>
+        <w:t>會員可在文章底部點擊有幫助，系統會統計按讚數量。</w:t>
+      </w:r>
+    </w:p>
+    <w:p>
+      <w:pPr>
+        <w:pStyle w:val="ListBullet"/>
+        <w:spacing w:before="0" w:after="80" w:line="300" w:lineRule="auto"/>
+      </w:pPr>
+      <w:r>
+        <w:rPr>
+          <w:rFonts w:ascii="Microsoft JhengHei" w:hAnsi="Microsoft JhengHei" w:eastAsia="Microsoft JhengHei"/>
+          <w:color w:val="122320"/>
+          <w:sz w:val="21"/>
+        </w:rPr>
         <w:t>底部導覽保留，方便會員回到其他功能。</w:t>
       </w:r>
     </w:p>
@@ -1871,7 +1885,7 @@
           <w:color w:val="216B57"/>
           <w:sz w:val="26"/>
         </w:rPr>
-        <w:t>兌換券列表</w:t>
+        <w:t>文章互動統計</w:t>
       </w:r>
     </w:p>
     <w:p>
@@ -1885,7 +1899,7 @@
           <w:color w:val="122320"/>
           <w:sz w:val="22"/>
         </w:rPr>
-        <w:t>會員可查看自己取得的兌換券，包含待確認、可兌換與已使用狀態。</w:t>
+        <w:t>會員閱讀文章後可點擊有幫助，前台會顯示目前累計的互動人數。</w:t>
       </w:r>
     </w:p>
     <w:p>
@@ -1899,7 +1913,7 @@
           <w:color w:val="122320"/>
           <w:sz w:val="21"/>
         </w:rPr>
-        <w:t>待確認兌換券可被看見，但不可使用。</w:t>
+        <w:t>按讚數量由前台使用者互動累計，不由後台手動填寫。</w:t>
       </w:r>
     </w:p>
     <w:p>
@@ -1913,7 +1927,7 @@
           <w:color w:val="122320"/>
           <w:sz w:val="21"/>
         </w:rPr>
-        <w:t>人工確認後，狀態才會變成可兌換並取得兌換連結。</w:t>
+        <w:t>互動區固定在文章底部，會員閱讀完可直接操作。</w:t>
       </w:r>
     </w:p>
     <w:p>
@@ -1927,7 +1941,7 @@
           <w:color w:val="122320"/>
           <w:sz w:val="21"/>
         </w:rPr>
-        <w:t>可兌換券點擊後會進入兌換券詳情與確認使用流程。</w:t>
+        <w:t>已登入會員點擊後可更新統計數量。</w:t>
       </w:r>
     </w:p>
     <w:p>
@@ -1947,7 +1961,7 @@
               <a:graphicData uri="http://schemas.openxmlformats.org/drawingml/2006/picture">
                 <pic:pic>
                   <pic:nvPicPr>
-                    <pic:cNvPr id="0" name="front-07-coupons.png"/>
+                    <pic:cNvPr id="0" name="front-09-news-helpful.png"/>
                     <pic:cNvPicPr/>
                   </pic:nvPicPr>
                   <pic:blipFill>
@@ -1982,7 +1996,7 @@
           <w:color w:val="60706C"/>
           <w:sz w:val="18"/>
         </w:rPr>
-        <w:t>截圖：兌換券列表</w:t>
+        <w:t>截圖：文章互動統計</w:t>
       </w:r>
     </w:p>
     <w:p>
@@ -1996,7 +2010,7 @@
           <w:color w:val="216B57"/>
           <w:sz w:val="26"/>
         </w:rPr>
-        <w:t>會員中心</w:t>
+        <w:t>兌換券列表</w:t>
       </w:r>
     </w:p>
     <w:p>
@@ -2010,7 +2024,7 @@
           <w:color w:val="122320"/>
           <w:sz w:val="22"/>
         </w:rPr>
-        <w:t>會員中心提供會員資料、邀請好友、邀請紀錄與客服協助入口。</w:t>
+        <w:t>會員可查看自己取得的兌換券，包含待確認、可兌換與已使用狀態。</w:t>
       </w:r>
     </w:p>
     <w:p>
@@ -2024,7 +2038,7 @@
           <w:color w:val="122320"/>
           <w:sz w:val="21"/>
         </w:rPr>
-        <w:t>可編輯姓名與 email。</w:t>
+        <w:t>待確認兌換券可被看見，但不可使用。</w:t>
       </w:r>
     </w:p>
     <w:p>
@@ -2038,7 +2052,7 @@
           <w:color w:val="122320"/>
           <w:sz w:val="21"/>
         </w:rPr>
-        <w:t>邀請好友會使用會員專屬分享連結。</w:t>
+        <w:t>人工確認後，狀態才會變成可兌換並取得兌換連結。</w:t>
       </w:r>
     </w:p>
     <w:p>
@@ -2052,7 +2066,7 @@
           <w:color w:val="122320"/>
           <w:sz w:val="21"/>
         </w:rPr>
-        <w:t>邀請紀錄會顯示透過會員連結加入的好友紀錄。</w:t>
+        <w:t>可兌換券點擊後會進入兌換券詳情與確認使用流程。</w:t>
       </w:r>
     </w:p>
     <w:p>
@@ -2072,7 +2086,7 @@
               <a:graphicData uri="http://schemas.openxmlformats.org/drawingml/2006/picture">
                 <pic:pic>
                   <pic:nvPicPr>
-                    <pic:cNvPr id="0" name="front-08-member.png"/>
+                    <pic:cNvPr id="0" name="front-07-coupons.png"/>
                     <pic:cNvPicPr/>
                   </pic:nvPicPr>
                   <pic:blipFill>
@@ -2107,6 +2121,131 @@
           <w:color w:val="60706C"/>
           <w:sz w:val="18"/>
         </w:rPr>
+        <w:t>截圖：兌換券列表</w:t>
+      </w:r>
+    </w:p>
+    <w:p>
+      <w:pPr>
+        <w:spacing w:before="200" w:after="120" w:line="300" w:lineRule="auto"/>
+      </w:pPr>
+      <w:r>
+        <w:rPr>
+          <w:rFonts w:ascii="Microsoft JhengHei" w:hAnsi="Microsoft JhengHei" w:eastAsia="Microsoft JhengHei"/>
+          <w:b/>
+          <w:color w:val="216B57"/>
+          <w:sz w:val="26"/>
+        </w:rPr>
+        <w:t>會員中心</w:t>
+      </w:r>
+    </w:p>
+    <w:p>
+      <w:pPr>
+        <w:spacing w:before="0" w:after="100" w:line="300" w:lineRule="auto"/>
+      </w:pPr>
+      <w:r>
+        <w:rPr>
+          <w:rFonts w:ascii="Microsoft JhengHei" w:hAnsi="Microsoft JhengHei" w:eastAsia="Microsoft JhengHei"/>
+          <w:b w:val="0"/>
+          <w:color w:val="122320"/>
+          <w:sz w:val="22"/>
+        </w:rPr>
+        <w:t>會員中心提供會員資料、邀請好友、邀請紀錄與客服協助入口。</w:t>
+      </w:r>
+    </w:p>
+    <w:p>
+      <w:pPr>
+        <w:pStyle w:val="ListBullet"/>
+        <w:spacing w:before="0" w:after="80" w:line="300" w:lineRule="auto"/>
+      </w:pPr>
+      <w:r>
+        <w:rPr>
+          <w:rFonts w:ascii="Microsoft JhengHei" w:hAnsi="Microsoft JhengHei" w:eastAsia="Microsoft JhengHei"/>
+          <w:color w:val="122320"/>
+          <w:sz w:val="21"/>
+        </w:rPr>
+        <w:t>可編輯姓名與 email。</w:t>
+      </w:r>
+    </w:p>
+    <w:p>
+      <w:pPr>
+        <w:pStyle w:val="ListBullet"/>
+        <w:spacing w:before="0" w:after="80" w:line="300" w:lineRule="auto"/>
+      </w:pPr>
+      <w:r>
+        <w:rPr>
+          <w:rFonts w:ascii="Microsoft JhengHei" w:hAnsi="Microsoft JhengHei" w:eastAsia="Microsoft JhengHei"/>
+          <w:color w:val="122320"/>
+          <w:sz w:val="21"/>
+        </w:rPr>
+        <w:t>邀請好友會使用會員專屬分享連結。</w:t>
+      </w:r>
+    </w:p>
+    <w:p>
+      <w:pPr>
+        <w:pStyle w:val="ListBullet"/>
+        <w:spacing w:before="0" w:after="80" w:line="300" w:lineRule="auto"/>
+      </w:pPr>
+      <w:r>
+        <w:rPr>
+          <w:rFonts w:ascii="Microsoft JhengHei" w:hAnsi="Microsoft JhengHei" w:eastAsia="Microsoft JhengHei"/>
+          <w:color w:val="122320"/>
+          <w:sz w:val="21"/>
+        </w:rPr>
+        <w:t>邀請紀錄會顯示透過會員連結加入的好友紀錄。</w:t>
+      </w:r>
+    </w:p>
+    <w:p>
+      <w:pPr>
+        <w:spacing w:before="80" w:after="60" w:line="300" w:lineRule="auto"/>
+        <w:jc w:val="center"/>
+      </w:pPr>
+      <w:r>
+        <w:drawing>
+          <wp:inline xmlns:a="http://schemas.openxmlformats.org/drawingml/2006/main" xmlns:pic="http://schemas.openxmlformats.org/drawingml/2006/picture">
+            <wp:extent cx="2240280" cy="4848196"/>
+            <wp:docPr id="9" name="Picture 9"/>
+            <wp:cNvGraphicFramePr>
+              <a:graphicFrameLocks noChangeAspect="1"/>
+            </wp:cNvGraphicFramePr>
+            <a:graphic>
+              <a:graphicData uri="http://schemas.openxmlformats.org/drawingml/2006/picture">
+                <pic:pic>
+                  <pic:nvPicPr>
+                    <pic:cNvPr id="0" name="front-08-member.png"/>
+                    <pic:cNvPicPr/>
+                  </pic:nvPicPr>
+                  <pic:blipFill>
+                    <a:blip r:embed="rId19"/>
+                    <a:stretch>
+                      <a:fillRect/>
+                    </a:stretch>
+                  </pic:blipFill>
+                  <pic:spPr>
+                    <a:xfrm>
+                      <a:off x="0" y="0"/>
+                      <a:ext cx="2240280" cy="4848196"/>
+                    </a:xfrm>
+                    <a:prstGeom prst="rect"/>
+                  </pic:spPr>
+                </pic:pic>
+              </a:graphicData>
+            </a:graphic>
+          </wp:inline>
+        </w:drawing>
+      </w:r>
+    </w:p>
+    <w:p>
+      <w:pPr>
+        <w:spacing w:before="0" w:after="200" w:line="300" w:lineRule="auto"/>
+        <w:jc w:val="center"/>
+      </w:pPr>
+      <w:r>
+        <w:rPr>
+          <w:rFonts w:ascii="Microsoft JhengHei" w:hAnsi="Microsoft JhengHei" w:eastAsia="Microsoft JhengHei"/>
+          <w:b w:val="0"/>
+          <w:color w:val="60706C"/>
+          <w:sz w:val="18"/>
+        </w:rPr>
         <w:t>截圖：會員中心</w:t>
       </w:r>
     </w:p>
@@ -2145,7 +2284,7 @@
           <w:color w:val="122320"/>
           <w:sz w:val="22"/>
         </w:rPr>
-        <w:t>以下截圖取自正式站 https://veeva-admin.web.app，以桌面管理情境呈現。</w:t>
+        <w:t>以下截圖以後台管理平台的桌面管理情境呈現，包含正式站與同版本驗收畫面。</w:t>
       </w:r>
     </w:p>
     <w:p>
@@ -2202,131 +2341,6 @@
           <w:sz w:val="21"/>
         </w:rPr>
         <w:t>左側導覽可進入權限、會員、活動、獎勵、最新資訊與兌換券管理。</w:t>
-      </w:r>
-    </w:p>
-    <w:p>
-      <w:pPr>
-        <w:spacing w:before="80" w:after="60" w:line="300" w:lineRule="auto"/>
-        <w:jc w:val="center"/>
-      </w:pPr>
-      <w:r>
-        <w:drawing>
-          <wp:inline xmlns:a="http://schemas.openxmlformats.org/drawingml/2006/main" xmlns:pic="http://schemas.openxmlformats.org/drawingml/2006/picture">
-            <wp:extent cx="5760720" cy="3798277"/>
-            <wp:docPr id="9" name="Picture 9"/>
-            <wp:cNvGraphicFramePr>
-              <a:graphicFrameLocks noChangeAspect="1"/>
-            </wp:cNvGraphicFramePr>
-            <a:graphic>
-              <a:graphicData uri="http://schemas.openxmlformats.org/drawingml/2006/picture">
-                <pic:pic>
-                  <pic:nvPicPr>
-                    <pic:cNvPr id="0" name="admin-01-dashboard.png"/>
-                    <pic:cNvPicPr/>
-                  </pic:nvPicPr>
-                  <pic:blipFill>
-                    <a:blip r:embed="rId19"/>
-                    <a:stretch>
-                      <a:fillRect/>
-                    </a:stretch>
-                  </pic:blipFill>
-                  <pic:spPr>
-                    <a:xfrm>
-                      <a:off x="0" y="0"/>
-                      <a:ext cx="5760720" cy="3798277"/>
-                    </a:xfrm>
-                    <a:prstGeom prst="rect"/>
-                  </pic:spPr>
-                </pic:pic>
-              </a:graphicData>
-            </a:graphic>
-          </wp:inline>
-        </w:drawing>
-      </w:r>
-    </w:p>
-    <w:p>
-      <w:pPr>
-        <w:spacing w:before="0" w:after="200" w:line="300" w:lineRule="auto"/>
-        <w:jc w:val="center"/>
-      </w:pPr>
-      <w:r>
-        <w:rPr>
-          <w:rFonts w:ascii="Microsoft JhengHei" w:hAnsi="Microsoft JhengHei" w:eastAsia="Microsoft JhengHei"/>
-          <w:b w:val="0"/>
-          <w:color w:val="60706C"/>
-          <w:sz w:val="18"/>
-        </w:rPr>
-        <w:t>截圖：儀表板</w:t>
-      </w:r>
-    </w:p>
-    <w:p>
-      <w:pPr>
-        <w:spacing w:before="200" w:after="120" w:line="300" w:lineRule="auto"/>
-      </w:pPr>
-      <w:r>
-        <w:rPr>
-          <w:rFonts w:ascii="Microsoft JhengHei" w:hAnsi="Microsoft JhengHei" w:eastAsia="Microsoft JhengHei"/>
-          <w:b/>
-          <w:color w:val="216B57"/>
-          <w:sz w:val="26"/>
-        </w:rPr>
-        <w:t>權限管理</w:t>
-      </w:r>
-    </w:p>
-    <w:p>
-      <w:pPr>
-        <w:spacing w:before="0" w:after="100" w:line="300" w:lineRule="auto"/>
-      </w:pPr>
-      <w:r>
-        <w:rPr>
-          <w:rFonts w:ascii="Microsoft JhengHei" w:hAnsi="Microsoft JhengHei" w:eastAsia="Microsoft JhengHei"/>
-          <w:b w:val="0"/>
-          <w:color w:val="122320"/>
-          <w:sz w:val="22"/>
-        </w:rPr>
-        <w:t>管理後台管理者角色、啟用狀態與可操作權限。</w:t>
-      </w:r>
-    </w:p>
-    <w:p>
-      <w:pPr>
-        <w:pStyle w:val="ListBullet"/>
-        <w:spacing w:before="0" w:after="80" w:line="300" w:lineRule="auto"/>
-      </w:pPr>
-      <w:r>
-        <w:rPr>
-          <w:rFonts w:ascii="Microsoft JhengHei" w:hAnsi="Microsoft JhengHei" w:eastAsia="Microsoft JhengHei"/>
-          <w:color w:val="122320"/>
-          <w:sz w:val="21"/>
-        </w:rPr>
-        <w:t>可從 LINE 會員建立管理者。</w:t>
-      </w:r>
-    </w:p>
-    <w:p>
-      <w:pPr>
-        <w:pStyle w:val="ListBullet"/>
-        <w:spacing w:before="0" w:after="80" w:line="300" w:lineRule="auto"/>
-      </w:pPr>
-      <w:r>
-        <w:rPr>
-          <w:rFonts w:ascii="Microsoft JhengHei" w:hAnsi="Microsoft JhengHei" w:eastAsia="Microsoft JhengHei"/>
-          <w:color w:val="122320"/>
-          <w:sz w:val="21"/>
-        </w:rPr>
-        <w:t>支援擁有者、管理員等角色與權限編輯。</w:t>
-      </w:r>
-    </w:p>
-    <w:p>
-      <w:pPr>
-        <w:pStyle w:val="ListBullet"/>
-        <w:spacing w:before="0" w:after="80" w:line="300" w:lineRule="auto"/>
-      </w:pPr>
-      <w:r>
-        <w:rPr>
-          <w:rFonts w:ascii="Microsoft JhengHei" w:hAnsi="Microsoft JhengHei" w:eastAsia="Microsoft JhengHei"/>
-          <w:color w:val="122320"/>
-          <w:sz w:val="21"/>
-        </w:rPr>
-        <w:t>不顯示 LINE login ID，降低畫面資訊干擾。</w:t>
       </w:r>
     </w:p>
     <w:p>
@@ -2346,7 +2360,7 @@
               <a:graphicData uri="http://schemas.openxmlformats.org/drawingml/2006/picture">
                 <pic:pic>
                   <pic:nvPicPr>
-                    <pic:cNvPr id="0" name="admin-02-permissions.png"/>
+                    <pic:cNvPr id="0" name="admin-01-dashboard.png"/>
                     <pic:cNvPicPr/>
                   </pic:nvPicPr>
                   <pic:blipFill>
@@ -2381,7 +2395,7 @@
           <w:color w:val="60706C"/>
           <w:sz w:val="18"/>
         </w:rPr>
-        <w:t>截圖：權限管理</w:t>
+        <w:t>截圖：儀表板</w:t>
       </w:r>
     </w:p>
     <w:p>
@@ -2395,7 +2409,7 @@
           <w:color w:val="216B57"/>
           <w:sz w:val="26"/>
         </w:rPr>
-        <w:t>會員管理</w:t>
+        <w:t>權限管理</w:t>
       </w:r>
     </w:p>
     <w:p>
@@ -2409,7 +2423,7 @@
           <w:color w:val="122320"/>
           <w:sz w:val="22"/>
         </w:rPr>
-        <w:t>查看已登入會員、會員狀態、角色標籤與會員設定。</w:t>
+        <w:t>管理後台管理者角色、啟用狀態與可操作權限。</w:t>
       </w:r>
     </w:p>
     <w:p>
@@ -2423,7 +2437,7 @@
           <w:color w:val="122320"/>
           <w:sz w:val="21"/>
         </w:rPr>
-        <w:t>會員列表顯示會員名稱、最後登入時間與操作。</w:t>
+        <w:t>可從 LINE 會員建立管理者。</w:t>
       </w:r>
     </w:p>
     <w:p>
@@ -2437,7 +2451,7 @@
           <w:color w:val="122320"/>
           <w:sz w:val="21"/>
         </w:rPr>
-        <w:t>可編輯會員設定與發送兌換券。</w:t>
+        <w:t>支援擁有者、管理員等角色與權限編輯。</w:t>
       </w:r>
     </w:p>
     <w:p>
@@ -2451,7 +2465,7 @@
           <w:color w:val="122320"/>
           <w:sz w:val="21"/>
         </w:rPr>
-        <w:t>支援搜尋、分頁、待審核與已審核分頁管理。</w:t>
+        <w:t>不顯示 LINE login ID，降低畫面資訊干擾。</w:t>
       </w:r>
     </w:p>
     <w:p>
@@ -2471,7 +2485,7 @@
               <a:graphicData uri="http://schemas.openxmlformats.org/drawingml/2006/picture">
                 <pic:pic>
                   <pic:nvPicPr>
-                    <pic:cNvPr id="0" name="admin-03-members.png"/>
+                    <pic:cNvPr id="0" name="admin-02-permissions.png"/>
                     <pic:cNvPicPr/>
                   </pic:nvPicPr>
                   <pic:blipFill>
@@ -2506,7 +2520,7 @@
           <w:color w:val="60706C"/>
           <w:sz w:val="18"/>
         </w:rPr>
-        <w:t>截圖：會員管理</w:t>
+        <w:t>截圖：權限管理</w:t>
       </w:r>
     </w:p>
     <w:p>
@@ -2520,7 +2534,7 @@
           <w:color w:val="216B57"/>
           <w:sz w:val="26"/>
         </w:rPr>
-        <w:t>活動管理</w:t>
+        <w:t>會員管理</w:t>
       </w:r>
     </w:p>
     <w:p>
@@ -2534,7 +2548,7 @@
           <w:color w:val="122320"/>
           <w:sz w:val="22"/>
         </w:rPr>
-        <w:t>新增、編輯、預覽、啟停與封存活動。</w:t>
+        <w:t>查看已登入會員、會員狀態、角色標籤與會員設定。</w:t>
       </w:r>
     </w:p>
     <w:p>
@@ -2548,7 +2562,7 @@
           <w:color w:val="122320"/>
           <w:sz w:val="21"/>
         </w:rPr>
-        <w:t>支援問卷活動與活動報名類活動。</w:t>
+        <w:t>會員列表顯示會員名稱、最後登入時間與操作。</w:t>
       </w:r>
     </w:p>
     <w:p>
@@ -2562,7 +2576,7 @@
           <w:color w:val="122320"/>
           <w:sz w:val="21"/>
         </w:rPr>
-        <w:t>可設定完成任務獎勵與邀請者二段式獎勵。</w:t>
+        <w:t>可編輯會員設定與發送兌換券。</w:t>
       </w:r>
     </w:p>
     <w:p>
@@ -2576,7 +2590,7 @@
           <w:color w:val="122320"/>
           <w:sz w:val="21"/>
         </w:rPr>
-        <w:t>活動圖片支援拖曳上傳與壓縮後存放 Firebase Storage。</w:t>
+        <w:t>支援搜尋、分頁、待審核與已審核分頁管理。</w:t>
       </w:r>
     </w:p>
     <w:p>
@@ -2596,7 +2610,7 @@
               <a:graphicData uri="http://schemas.openxmlformats.org/drawingml/2006/picture">
                 <pic:pic>
                   <pic:nvPicPr>
-                    <pic:cNvPr id="0" name="admin-04-activities.png"/>
+                    <pic:cNvPr id="0" name="admin-03-members.png"/>
                     <pic:cNvPicPr/>
                   </pic:nvPicPr>
                   <pic:blipFill>
@@ -2631,6 +2645,131 @@
           <w:color w:val="60706C"/>
           <w:sz w:val="18"/>
         </w:rPr>
+        <w:t>截圖：會員管理</w:t>
+      </w:r>
+    </w:p>
+    <w:p>
+      <w:pPr>
+        <w:spacing w:before="200" w:after="120" w:line="300" w:lineRule="auto"/>
+      </w:pPr>
+      <w:r>
+        <w:rPr>
+          <w:rFonts w:ascii="Microsoft JhengHei" w:hAnsi="Microsoft JhengHei" w:eastAsia="Microsoft JhengHei"/>
+          <w:b/>
+          <w:color w:val="216B57"/>
+          <w:sz w:val="26"/>
+        </w:rPr>
+        <w:t>活動管理</w:t>
+      </w:r>
+    </w:p>
+    <w:p>
+      <w:pPr>
+        <w:spacing w:before="0" w:after="100" w:line="300" w:lineRule="auto"/>
+      </w:pPr>
+      <w:r>
+        <w:rPr>
+          <w:rFonts w:ascii="Microsoft JhengHei" w:hAnsi="Microsoft JhengHei" w:eastAsia="Microsoft JhengHei"/>
+          <w:b w:val="0"/>
+          <w:color w:val="122320"/>
+          <w:sz w:val="22"/>
+        </w:rPr>
+        <w:t>新增、編輯、預覽、啟停與封存活動。</w:t>
+      </w:r>
+    </w:p>
+    <w:p>
+      <w:pPr>
+        <w:pStyle w:val="ListBullet"/>
+        <w:spacing w:before="0" w:after="80" w:line="300" w:lineRule="auto"/>
+      </w:pPr>
+      <w:r>
+        <w:rPr>
+          <w:rFonts w:ascii="Microsoft JhengHei" w:hAnsi="Microsoft JhengHei" w:eastAsia="Microsoft JhengHei"/>
+          <w:color w:val="122320"/>
+          <w:sz w:val="21"/>
+        </w:rPr>
+        <w:t>支援問卷活動與活動報名類活動。</w:t>
+      </w:r>
+    </w:p>
+    <w:p>
+      <w:pPr>
+        <w:pStyle w:val="ListBullet"/>
+        <w:spacing w:before="0" w:after="80" w:line="300" w:lineRule="auto"/>
+      </w:pPr>
+      <w:r>
+        <w:rPr>
+          <w:rFonts w:ascii="Microsoft JhengHei" w:hAnsi="Microsoft JhengHei" w:eastAsia="Microsoft JhengHei"/>
+          <w:color w:val="122320"/>
+          <w:sz w:val="21"/>
+        </w:rPr>
+        <w:t>可設定完成任務獎勵與邀請者二段式獎勵。</w:t>
+      </w:r>
+    </w:p>
+    <w:p>
+      <w:pPr>
+        <w:pStyle w:val="ListBullet"/>
+        <w:spacing w:before="0" w:after="80" w:line="300" w:lineRule="auto"/>
+      </w:pPr>
+      <w:r>
+        <w:rPr>
+          <w:rFonts w:ascii="Microsoft JhengHei" w:hAnsi="Microsoft JhengHei" w:eastAsia="Microsoft JhengHei"/>
+          <w:color w:val="122320"/>
+          <w:sz w:val="21"/>
+        </w:rPr>
+        <w:t>活動圖片支援拖曳上傳與壓縮後存放 Firebase Storage。</w:t>
+      </w:r>
+    </w:p>
+    <w:p>
+      <w:pPr>
+        <w:spacing w:before="80" w:after="60" w:line="300" w:lineRule="auto"/>
+        <w:jc w:val="center"/>
+      </w:pPr>
+      <w:r>
+        <w:drawing>
+          <wp:inline xmlns:a="http://schemas.openxmlformats.org/drawingml/2006/main" xmlns:pic="http://schemas.openxmlformats.org/drawingml/2006/picture">
+            <wp:extent cx="5760720" cy="4000500"/>
+            <wp:docPr id="13" name="Picture 13"/>
+            <wp:cNvGraphicFramePr>
+              <a:graphicFrameLocks noChangeAspect="1"/>
+            </wp:cNvGraphicFramePr>
+            <a:graphic>
+              <a:graphicData uri="http://schemas.openxmlformats.org/drawingml/2006/picture">
+                <pic:pic>
+                  <pic:nvPicPr>
+                    <pic:cNvPr id="0" name="admin-04-activities.png"/>
+                    <pic:cNvPicPr/>
+                  </pic:nvPicPr>
+                  <pic:blipFill>
+                    <a:blip r:embed="rId23"/>
+                    <a:stretch>
+                      <a:fillRect/>
+                    </a:stretch>
+                  </pic:blipFill>
+                  <pic:spPr>
+                    <a:xfrm>
+                      <a:off x="0" y="0"/>
+                      <a:ext cx="5760720" cy="4000500"/>
+                    </a:xfrm>
+                    <a:prstGeom prst="rect"/>
+                  </pic:spPr>
+                </pic:pic>
+              </a:graphicData>
+            </a:graphic>
+          </wp:inline>
+        </w:drawing>
+      </w:r>
+    </w:p>
+    <w:p>
+      <w:pPr>
+        <w:spacing w:before="0" w:after="200" w:line="300" w:lineRule="auto"/>
+        <w:jc w:val="center"/>
+      </w:pPr>
+      <w:r>
+        <w:rPr>
+          <w:rFonts w:ascii="Microsoft JhengHei" w:hAnsi="Microsoft JhengHei" w:eastAsia="Microsoft JhengHei"/>
+          <w:b w:val="0"/>
+          <w:color w:val="60706C"/>
+          <w:sz w:val="18"/>
+        </w:rPr>
         <w:t>截圖：活動管理</w:t>
       </w:r>
     </w:p>
@@ -2702,131 +2841,6 @@
           <w:sz w:val="21"/>
         </w:rPr>
         <w:t>二段式邀請者獎勵會在人工發放時一併處理。</w:t>
-      </w:r>
-    </w:p>
-    <w:p>
-      <w:pPr>
-        <w:spacing w:before="80" w:after="60" w:line="300" w:lineRule="auto"/>
-        <w:jc w:val="center"/>
-      </w:pPr>
-      <w:r>
-        <w:drawing>
-          <wp:inline xmlns:a="http://schemas.openxmlformats.org/drawingml/2006/main" xmlns:pic="http://schemas.openxmlformats.org/drawingml/2006/picture">
-            <wp:extent cx="5760720" cy="3798277"/>
-            <wp:docPr id="13" name="Picture 13"/>
-            <wp:cNvGraphicFramePr>
-              <a:graphicFrameLocks noChangeAspect="1"/>
-            </wp:cNvGraphicFramePr>
-            <a:graphic>
-              <a:graphicData uri="http://schemas.openxmlformats.org/drawingml/2006/picture">
-                <pic:pic>
-                  <pic:nvPicPr>
-                    <pic:cNvPr id="0" name="admin-05-reward-distribution.png"/>
-                    <pic:cNvPicPr/>
-                  </pic:nvPicPr>
-                  <pic:blipFill>
-                    <a:blip r:embed="rId23"/>
-                    <a:stretch>
-                      <a:fillRect/>
-                    </a:stretch>
-                  </pic:blipFill>
-                  <pic:spPr>
-                    <a:xfrm>
-                      <a:off x="0" y="0"/>
-                      <a:ext cx="5760720" cy="3798277"/>
-                    </a:xfrm>
-                    <a:prstGeom prst="rect"/>
-                  </pic:spPr>
-                </pic:pic>
-              </a:graphicData>
-            </a:graphic>
-          </wp:inline>
-        </w:drawing>
-      </w:r>
-    </w:p>
-    <w:p>
-      <w:pPr>
-        <w:spacing w:before="0" w:after="200" w:line="300" w:lineRule="auto"/>
-        <w:jc w:val="center"/>
-      </w:pPr>
-      <w:r>
-        <w:rPr>
-          <w:rFonts w:ascii="Microsoft JhengHei" w:hAnsi="Microsoft JhengHei" w:eastAsia="Microsoft JhengHei"/>
-          <w:b w:val="0"/>
-          <w:color w:val="60706C"/>
-          <w:sz w:val="18"/>
-        </w:rPr>
-        <w:t>截圖：獎勵發放</w:t>
-      </w:r>
-    </w:p>
-    <w:p>
-      <w:pPr>
-        <w:spacing w:before="200" w:after="120" w:line="300" w:lineRule="auto"/>
-      </w:pPr>
-      <w:r>
-        <w:rPr>
-          <w:rFonts w:ascii="Microsoft JhengHei" w:hAnsi="Microsoft JhengHei" w:eastAsia="Microsoft JhengHei"/>
-          <w:b/>
-          <w:color w:val="216B57"/>
-          <w:sz w:val="26"/>
-        </w:rPr>
-        <w:t>最新資訊管理</w:t>
-      </w:r>
-    </w:p>
-    <w:p>
-      <w:pPr>
-        <w:spacing w:before="0" w:after="100" w:line="300" w:lineRule="auto"/>
-      </w:pPr>
-      <w:r>
-        <w:rPr>
-          <w:rFonts w:ascii="Microsoft JhengHei" w:hAnsi="Microsoft JhengHei" w:eastAsia="Microsoft JhengHei"/>
-          <w:b w:val="0"/>
-          <w:color w:val="122320"/>
-          <w:sz w:val="22"/>
-        </w:rPr>
-        <w:t>管理文章清單、發布狀態、分類、來源與文章內容。</w:t>
-      </w:r>
-    </w:p>
-    <w:p>
-      <w:pPr>
-        <w:pStyle w:val="ListBullet"/>
-        <w:spacing w:before="0" w:after="80" w:line="300" w:lineRule="auto"/>
-      </w:pPr>
-      <w:r>
-        <w:rPr>
-          <w:rFonts w:ascii="Microsoft JhengHei" w:hAnsi="Microsoft JhengHei" w:eastAsia="Microsoft JhengHei"/>
-          <w:color w:val="122320"/>
-          <w:sz w:val="21"/>
-        </w:rPr>
-        <w:t>新增文章使用類 Word 的自由排版編輯器。</w:t>
-      </w:r>
-    </w:p>
-    <w:p>
-      <w:pPr>
-        <w:pStyle w:val="ListBullet"/>
-        <w:spacing w:before="0" w:after="80" w:line="300" w:lineRule="auto"/>
-      </w:pPr>
-      <w:r>
-        <w:rPr>
-          <w:rFonts w:ascii="Microsoft JhengHei" w:hAnsi="Microsoft JhengHei" w:eastAsia="Microsoft JhengHei"/>
-          <w:color w:val="122320"/>
-          <w:sz w:val="21"/>
-        </w:rPr>
-        <w:t>支援文字粗體、斜體、字體大小與引用樣式。</w:t>
-      </w:r>
-    </w:p>
-    <w:p>
-      <w:pPr>
-        <w:pStyle w:val="ListBullet"/>
-        <w:spacing w:before="0" w:after="80" w:line="300" w:lineRule="auto"/>
-      </w:pPr>
-      <w:r>
-        <w:rPr>
-          <w:rFonts w:ascii="Microsoft JhengHei" w:hAnsi="Microsoft JhengHei" w:eastAsia="Microsoft JhengHei"/>
-          <w:color w:val="122320"/>
-          <w:sz w:val="21"/>
-        </w:rPr>
-        <w:t>文章表格已調整為滿版寬度。</w:t>
       </w:r>
     </w:p>
     <w:p>
@@ -2846,7 +2860,7 @@
               <a:graphicData uri="http://schemas.openxmlformats.org/drawingml/2006/picture">
                 <pic:pic>
                   <pic:nvPicPr>
-                    <pic:cNvPr id="0" name="admin-06-news.png"/>
+                    <pic:cNvPr id="0" name="admin-05-reward-distribution.png"/>
                     <pic:cNvPicPr/>
                   </pic:nvPicPr>
                   <pic:blipFill>
@@ -2881,7 +2895,7 @@
           <w:color w:val="60706C"/>
           <w:sz w:val="18"/>
         </w:rPr>
-        <w:t>截圖：最新資訊管理</w:t>
+        <w:t>截圖：獎勵發放</w:t>
       </w:r>
     </w:p>
     <w:p>
@@ -2895,7 +2909,7 @@
           <w:color w:val="216B57"/>
           <w:sz w:val="26"/>
         </w:rPr>
-        <w:t>兌換券管理</w:t>
+        <w:t>最新資訊管理</w:t>
       </w:r>
     </w:p>
     <w:p>
@@ -2909,7 +2923,7 @@
           <w:color w:val="122320"/>
           <w:sz w:val="22"/>
         </w:rPr>
-        <w:t>管理兌換券品項、分類、庫存、期限、圖片與序號連結。</w:t>
+        <w:t>管理文章清單、發布狀態、分類、來源與文章內容。</w:t>
       </w:r>
     </w:p>
     <w:p>
@@ -2923,7 +2937,7 @@
           <w:color w:val="122320"/>
           <w:sz w:val="21"/>
         </w:rPr>
-        <w:t>可新增與編輯兌換券。</w:t>
+        <w:t>新增文章使用類 Word 的自由排版編輯器。</w:t>
       </w:r>
     </w:p>
     <w:p>
@@ -2937,7 +2951,7 @@
           <w:color w:val="122320"/>
           <w:sz w:val="21"/>
         </w:rPr>
-        <w:t>支援拖曳上傳圖片與 Firebase Storage 預覽。</w:t>
+        <w:t>支援文字粗體、斜體、字體大小與引用樣式。</w:t>
       </w:r>
     </w:p>
     <w:p>
@@ -2951,18 +2965,32 @@
           <w:color w:val="122320"/>
           <w:sz w:val="21"/>
         </w:rPr>
-        <w:t>支援匯入 Excel / CSV / TXT 兌換連結並逐一分配給會員。</w:t>
+        <w:t>文章圖片可由編輯器直接上傳並插入內容。</w:t>
       </w:r>
     </w:p>
     <w:p>
       <w:pPr>
+        <w:pStyle w:val="ListBullet"/>
+        <w:spacing w:before="0" w:after="80" w:line="300" w:lineRule="auto"/>
+      </w:pPr>
+      <w:r>
+        <w:rPr>
+          <w:rFonts w:ascii="Microsoft JhengHei" w:hAnsi="Microsoft JhengHei" w:eastAsia="Microsoft JhengHei"/>
+          <w:color w:val="122320"/>
+          <w:sz w:val="21"/>
+        </w:rPr>
+        <w:t>文章表格已調整為滿版寬度。</w:t>
+      </w:r>
+    </w:p>
+    <w:p>
+      <w:pPr>
         <w:spacing w:before="80" w:after="60" w:line="300" w:lineRule="auto"/>
         <w:jc w:val="center"/>
       </w:pPr>
       <w:r>
         <w:drawing>
           <wp:inline xmlns:a="http://schemas.openxmlformats.org/drawingml/2006/main" xmlns:pic="http://schemas.openxmlformats.org/drawingml/2006/picture">
-            <wp:extent cx="5760720" cy="3798277"/>
+            <wp:extent cx="5760720" cy="4000500"/>
             <wp:docPr id="15" name="Picture 15"/>
             <wp:cNvGraphicFramePr>
               <a:graphicFrameLocks noChangeAspect="1"/>
@@ -2971,11 +2999,136 @@
               <a:graphicData uri="http://schemas.openxmlformats.org/drawingml/2006/picture">
                 <pic:pic>
                   <pic:nvPicPr>
-                    <pic:cNvPr id="0" name="admin-07-rewards.png"/>
+                    <pic:cNvPr id="0" name="admin-06-news.png"/>
                     <pic:cNvPicPr/>
                   </pic:nvPicPr>
                   <pic:blipFill>
                     <a:blip r:embed="rId25"/>
+                    <a:stretch>
+                      <a:fillRect/>
+                    </a:stretch>
+                  </pic:blipFill>
+                  <pic:spPr>
+                    <a:xfrm>
+                      <a:off x="0" y="0"/>
+                      <a:ext cx="5760720" cy="4000500"/>
+                    </a:xfrm>
+                    <a:prstGeom prst="rect"/>
+                  </pic:spPr>
+                </pic:pic>
+              </a:graphicData>
+            </a:graphic>
+          </wp:inline>
+        </w:drawing>
+      </w:r>
+    </w:p>
+    <w:p>
+      <w:pPr>
+        <w:spacing w:before="0" w:after="200" w:line="300" w:lineRule="auto"/>
+        <w:jc w:val="center"/>
+      </w:pPr>
+      <w:r>
+        <w:rPr>
+          <w:rFonts w:ascii="Microsoft JhengHei" w:hAnsi="Microsoft JhengHei" w:eastAsia="Microsoft JhengHei"/>
+          <w:b w:val="0"/>
+          <w:color w:val="60706C"/>
+          <w:sz w:val="18"/>
+        </w:rPr>
+        <w:t>截圖：最新資訊管理</w:t>
+      </w:r>
+    </w:p>
+    <w:p>
+      <w:pPr>
+        <w:spacing w:before="200" w:after="120" w:line="300" w:lineRule="auto"/>
+      </w:pPr>
+      <w:r>
+        <w:rPr>
+          <w:rFonts w:ascii="Microsoft JhengHei" w:hAnsi="Microsoft JhengHei" w:eastAsia="Microsoft JhengHei"/>
+          <w:b/>
+          <w:color w:val="216B57"/>
+          <w:sz w:val="26"/>
+        </w:rPr>
+        <w:t>文章編輯器</w:t>
+      </w:r>
+    </w:p>
+    <w:p>
+      <w:pPr>
+        <w:spacing w:before="0" w:after="100" w:line="300" w:lineRule="auto"/>
+      </w:pPr>
+      <w:r>
+        <w:rPr>
+          <w:rFonts w:ascii="Microsoft JhengHei" w:hAnsi="Microsoft JhengHei" w:eastAsia="Microsoft JhengHei"/>
+          <w:b w:val="0"/>
+          <w:color w:val="122320"/>
+          <w:sz w:val="22"/>
+        </w:rPr>
+        <w:t>新增或編輯文章時會開啟自由排版編輯器，可直接在後台完成文章內容排版。</w:t>
+      </w:r>
+    </w:p>
+    <w:p>
+      <w:pPr>
+        <w:pStyle w:val="ListBullet"/>
+        <w:spacing w:before="0" w:after="80" w:line="300" w:lineRule="auto"/>
+      </w:pPr>
+      <w:r>
+        <w:rPr>
+          <w:rFonts w:ascii="Microsoft JhengHei" w:hAnsi="Microsoft JhengHei" w:eastAsia="Microsoft JhengHei"/>
+          <w:color w:val="122320"/>
+          <w:sz w:val="21"/>
+        </w:rPr>
+        <w:t>編輯器提供粗體、斜體、字級、清單、引用、連結、圖片與分隔線工具。</w:t>
+      </w:r>
+    </w:p>
+    <w:p>
+      <w:pPr>
+        <w:pStyle w:val="ListBullet"/>
+        <w:spacing w:before="0" w:after="80" w:line="300" w:lineRule="auto"/>
+      </w:pPr>
+      <w:r>
+        <w:rPr>
+          <w:rFonts w:ascii="Microsoft JhengHei" w:hAnsi="Microsoft JhengHei" w:eastAsia="Microsoft JhengHei"/>
+          <w:color w:val="122320"/>
+          <w:sz w:val="21"/>
+        </w:rPr>
+        <w:t>文章內容區支援長內容捲動，方便編輯較長文章。</w:t>
+      </w:r>
+    </w:p>
+    <w:p>
+      <w:pPr>
+        <w:pStyle w:val="ListBullet"/>
+        <w:spacing w:before="0" w:after="80" w:line="300" w:lineRule="auto"/>
+      </w:pPr>
+      <w:r>
+        <w:rPr>
+          <w:rFonts w:ascii="Microsoft JhengHei" w:hAnsi="Microsoft JhengHei" w:eastAsia="Microsoft JhengHei"/>
+          <w:color w:val="122320"/>
+          <w:sz w:val="21"/>
+        </w:rPr>
+        <w:t>右側文章設定可管理列表摘要、來源、分類、發布日期、發布狀態、封面圖片與外部連結。</w:t>
+      </w:r>
+    </w:p>
+    <w:p>
+      <w:pPr>
+        <w:spacing w:before="80" w:after="60" w:line="300" w:lineRule="auto"/>
+        <w:jc w:val="center"/>
+      </w:pPr>
+      <w:r>
+        <w:drawing>
+          <wp:inline xmlns:a="http://schemas.openxmlformats.org/drawingml/2006/main" xmlns:pic="http://schemas.openxmlformats.org/drawingml/2006/picture">
+            <wp:extent cx="5760720" cy="3798277"/>
+            <wp:docPr id="16" name="Picture 16"/>
+            <wp:cNvGraphicFramePr>
+              <a:graphicFrameLocks noChangeAspect="1"/>
+            </wp:cNvGraphicFramePr>
+            <a:graphic>
+              <a:graphicData uri="http://schemas.openxmlformats.org/drawingml/2006/picture">
+                <pic:pic>
+                  <pic:nvPicPr>
+                    <pic:cNvPr id="0" name="admin-09-news-editor.png"/>
+                    <pic:cNvPicPr/>
+                  </pic:nvPicPr>
+                  <pic:blipFill>
+                    <a:blip r:embed="rId26"/>
                     <a:stretch>
                       <a:fillRect/>
                     </a:stretch>
@@ -3006,6 +3159,131 @@
           <w:color w:val="60706C"/>
           <w:sz w:val="18"/>
         </w:rPr>
+        <w:t>截圖：文章編輯器</w:t>
+      </w:r>
+    </w:p>
+    <w:p>
+      <w:pPr>
+        <w:spacing w:before="200" w:after="120" w:line="300" w:lineRule="auto"/>
+      </w:pPr>
+      <w:r>
+        <w:rPr>
+          <w:rFonts w:ascii="Microsoft JhengHei" w:hAnsi="Microsoft JhengHei" w:eastAsia="Microsoft JhengHei"/>
+          <w:b/>
+          <w:color w:val="216B57"/>
+          <w:sz w:val="26"/>
+        </w:rPr>
+        <w:t>兌換券管理</w:t>
+      </w:r>
+    </w:p>
+    <w:p>
+      <w:pPr>
+        <w:spacing w:before="0" w:after="100" w:line="300" w:lineRule="auto"/>
+      </w:pPr>
+      <w:r>
+        <w:rPr>
+          <w:rFonts w:ascii="Microsoft JhengHei" w:hAnsi="Microsoft JhengHei" w:eastAsia="Microsoft JhengHei"/>
+          <w:b w:val="0"/>
+          <w:color w:val="122320"/>
+          <w:sz w:val="22"/>
+        </w:rPr>
+        <w:t>管理兌換券品項、分類、庫存、期限、圖片與序號連結。</w:t>
+      </w:r>
+    </w:p>
+    <w:p>
+      <w:pPr>
+        <w:pStyle w:val="ListBullet"/>
+        <w:spacing w:before="0" w:after="80" w:line="300" w:lineRule="auto"/>
+      </w:pPr>
+      <w:r>
+        <w:rPr>
+          <w:rFonts w:ascii="Microsoft JhengHei" w:hAnsi="Microsoft JhengHei" w:eastAsia="Microsoft JhengHei"/>
+          <w:color w:val="122320"/>
+          <w:sz w:val="21"/>
+        </w:rPr>
+        <w:t>可新增與編輯兌換券。</w:t>
+      </w:r>
+    </w:p>
+    <w:p>
+      <w:pPr>
+        <w:pStyle w:val="ListBullet"/>
+        <w:spacing w:before="0" w:after="80" w:line="300" w:lineRule="auto"/>
+      </w:pPr>
+      <w:r>
+        <w:rPr>
+          <w:rFonts w:ascii="Microsoft JhengHei" w:hAnsi="Microsoft JhengHei" w:eastAsia="Microsoft JhengHei"/>
+          <w:color w:val="122320"/>
+          <w:sz w:val="21"/>
+        </w:rPr>
+        <w:t>支援拖曳上傳圖片與 Firebase Storage 預覽。</w:t>
+      </w:r>
+    </w:p>
+    <w:p>
+      <w:pPr>
+        <w:pStyle w:val="ListBullet"/>
+        <w:spacing w:before="0" w:after="80" w:line="300" w:lineRule="auto"/>
+      </w:pPr>
+      <w:r>
+        <w:rPr>
+          <w:rFonts w:ascii="Microsoft JhengHei" w:hAnsi="Microsoft JhengHei" w:eastAsia="Microsoft JhengHei"/>
+          <w:color w:val="122320"/>
+          <w:sz w:val="21"/>
+        </w:rPr>
+        <w:t>支援匯入 Excel / CSV / TXT 兌換連結並逐一分配給會員。</w:t>
+      </w:r>
+    </w:p>
+    <w:p>
+      <w:pPr>
+        <w:spacing w:before="80" w:after="60" w:line="300" w:lineRule="auto"/>
+        <w:jc w:val="center"/>
+      </w:pPr>
+      <w:r>
+        <w:drawing>
+          <wp:inline xmlns:a="http://schemas.openxmlformats.org/drawingml/2006/main" xmlns:pic="http://schemas.openxmlformats.org/drawingml/2006/picture">
+            <wp:extent cx="5760720" cy="3798277"/>
+            <wp:docPr id="17" name="Picture 17"/>
+            <wp:cNvGraphicFramePr>
+              <a:graphicFrameLocks noChangeAspect="1"/>
+            </wp:cNvGraphicFramePr>
+            <a:graphic>
+              <a:graphicData uri="http://schemas.openxmlformats.org/drawingml/2006/picture">
+                <pic:pic>
+                  <pic:nvPicPr>
+                    <pic:cNvPr id="0" name="admin-07-rewards.png"/>
+                    <pic:cNvPicPr/>
+                  </pic:nvPicPr>
+                  <pic:blipFill>
+                    <a:blip r:embed="rId27"/>
+                    <a:stretch>
+                      <a:fillRect/>
+                    </a:stretch>
+                  </pic:blipFill>
+                  <pic:spPr>
+                    <a:xfrm>
+                      <a:off x="0" y="0"/>
+                      <a:ext cx="5760720" cy="3798277"/>
+                    </a:xfrm>
+                    <a:prstGeom prst="rect"/>
+                  </pic:spPr>
+                </pic:pic>
+              </a:graphicData>
+            </a:graphic>
+          </wp:inline>
+        </w:drawing>
+      </w:r>
+    </w:p>
+    <w:p>
+      <w:pPr>
+        <w:spacing w:before="0" w:after="200" w:line="300" w:lineRule="auto"/>
+        <w:jc w:val="center"/>
+      </w:pPr>
+      <w:r>
+        <w:rPr>
+          <w:rFonts w:ascii="Microsoft JhengHei" w:hAnsi="Microsoft JhengHei" w:eastAsia="Microsoft JhengHei"/>
+          <w:b w:val="0"/>
+          <w:color w:val="60706C"/>
+          <w:sz w:val="18"/>
+        </w:rPr>
         <w:t>截圖：兌換券管理</w:t>
       </w:r>
     </w:p>
@@ -3062,7 +3340,7 @@
           <w:color w:val="122320"/>
           <w:sz w:val="21"/>
         </w:rPr>
-        <w:t>後續可放置 LIFF、通知、角色或活動預設參數。</w:t>
+        <w:t>後續如有額外新增功能，會在此頁新增。</w:t>
       </w:r>
     </w:p>
     <w:p>
@@ -3074,7 +3352,7 @@
         <w:drawing>
           <wp:inline xmlns:a="http://schemas.openxmlformats.org/drawingml/2006/main" xmlns:pic="http://schemas.openxmlformats.org/drawingml/2006/picture">
             <wp:extent cx="5760720" cy="3798277"/>
-            <wp:docPr id="16" name="Picture 16"/>
+            <wp:docPr id="18" name="Picture 18"/>
             <wp:cNvGraphicFramePr>
               <a:graphicFrameLocks noChangeAspect="1"/>
             </wp:cNvGraphicFramePr>
@@ -3086,7 +3364,7 @@
                     <pic:cNvPicPr/>
                   </pic:nvPicPr>
                   <pic:blipFill>
-                    <a:blip r:embed="rId26"/>
+                    <a:blip r:embed="rId28"/>
                     <a:stretch>
                       <a:fillRect/>
                     </a:stretch>

</xml_diff>